<commit_message>
Correct V9 final test-count reporting
</commit_message>
<xml_diff>
--- a/deliverables/22097191_ZHANG_YUE_V9_Final_Research_Project.docx
+++ b/deliverables/22097191_ZHANG_YUE_V9_Final_Research_Project.docx
@@ -839,7 +839,7 @@
         <w:rPr>
           <w:rFonts w:ascii="Times New Roman" w:hAnsi="Times New Roman"/>
         </w:rPr>
-        <w:t>The seventh contribution is methodological transparency. Protocols were committed before their corresponding outcome stages; large source-derived artifacts remain local; public summaries contain hashes and aggregate metrics; and 206 automated tests verify core behavior. The work preserves negative findings, including the weakness of BM25, the underperformance of naive fixed fusion, incomplete JSON output, low absolute Token-F1, and the absence of clinical human evaluation.</w:t>
+        <w:t>The seventh contribution is methodological transparency. Protocols were committed before their corresponding outcome stages; large source-derived artifacts remain local; public summaries contain hashes and aggregate metrics; and automated verification increased from 206 passing tests before the supplemental additions to 223 in the final V9 suite. The work preserves negative findings, including the weakness of BM25, the underperformance of naive fixed fusion, incomplete JSON output, low absolute Token-F1, and the absence of clinical human evaluation.</w:t>
       </w:r>
     </w:p>
     <w:p>
@@ -2299,7 +2299,7 @@
         <w:rPr>
           <w:rFonts w:ascii="Times New Roman" w:hAnsi="Times New Roman"/>
         </w:rPr>
-        <w:t>The implementation used local CUDA inference and preserved model revisions, configuration files, checkpoint hashes, result hashes, split fingerprints, and protocol commits. Large source-derived texts, image pixels, vectors, checkpoints, prompts, and per-row generations remained local under repository policy. Aggregate summaries, source-neutral code, hashes, tests, and a lightweight case index were public. The verified suite contained 206 passing automated tests before the supplemental additions; the final suite was rerun after integration.</w:t>
+        <w:t>The implementation used local CUDA inference and preserved model revisions, configuration files, checkpoint hashes, result hashes, split fingerprints, and protocol commits. Large source-derived texts, image pixels, vectors, checkpoints, prompts, and per-row generations remained local under repository policy. Aggregate summaries, source-neutral code, hashes, tests, and a lightweight case index were public. The verified suite contained 206 passing automated tests before the supplemental additions and 223 passing tests in the final V9 integration run.</w:t>
       </w:r>
     </w:p>
     <w:p>

</xml_diff>